<commit_message>
Xero invoice: real MERGEFIELD codes + Monzo bank details
Previous version had «FieldName» as plain text inside guillemets. Word
displays real merge fields that way so the preview looked correct, but
Xero's parser found no fields to substitute and rendered the
placeholder text on every live invoice.

Rewrote the template builder to emit actual <w:fldSimple> elements
carrying MERGEFIELD instructions. The XML now contains 22 real merge
fields across InvoiceNumber, ContactName, address lines, dates, line
items, subtotals, amount due, organisation VAT number, and payment
terms. Xero will populate all of them on render.

Bank details hardcoded to the real Monzo account (04-00-04 / 65693471)
since those don't vary per invoice.

Co-Authored-By: Claude Opus 4.7 (1M context) <noreply@anthropic.com>
</commit_message>
<xml_diff>
--- a/xero/webgro-invoice-template.docx
+++ b/xero/webgro-invoice-template.docx
@@ -111,16 +111,18 @@
               <w:spacing w:before="40" w:after="0"/>
               <w:jc w:val="right"/>
             </w:pPr>
-            <w:r>
-              <w:rPr>
-                <w:rFonts w:ascii="Space Grotesk" w:hAnsi="Space Grotesk" w:cs="Space Grotesk"/>
-                <w:b/>
-                <w:i w:val="0"/>
-                <w:color w:val="07080C"/>
-                <w:sz w:val="48"/>
-              </w:rPr>
-              <w:t>«InvoiceNumber»</w:t>
-            </w:r>
+            <w:fldSimple w:instr=" MERGEFIELD  InvoiceNumber  \* MERGEFORMAT ">
+              <w:r>
+                <w:rPr>
+                  <w:rFonts w:ascii="Space Grotesk" w:hAnsi="Space Grotesk" w:cs="Space Grotesk"/>
+                  <w:b/>
+                  <w:i w:val="0"/>
+                  <w:color w:val="07080C"/>
+                  <w:sz w:val="48"/>
+                </w:rPr>
+                <w:t>«InvoiceNumber»</w:t>
+              </w:r>
+            </w:fldSimple>
           </w:p>
         </w:tc>
       </w:tr>
@@ -352,12 +354,24 @@
                 <w:color w:val="8B94A8"/>
                 <w:sz w:val="14"/>
               </w:rPr>
-              <w:t>VAT No. [YOUR VAT NUMBER]</w:t>
+              <w:t xml:space="preserve">VAT No. </w:t>
             </w:r>
+            <w:fldSimple w:instr=" MERGEFIELD  OrganisationTaxNumber  \* MERGEFORMAT ">
+              <w:r>
+                <w:rPr>
+                  <w:rFonts w:ascii="JetBrains Mono" w:hAnsi="JetBrains Mono" w:cs="JetBrains Mono"/>
+                  <w:b w:val="0"/>
+                  <w:i w:val="0"/>
+                  <w:color w:val="8B94A8"/>
+                  <w:sz w:val="14"/>
+                </w:rPr>
+                <w:t>«OrganisationTaxNumber»</w:t>
+              </w:r>
+            </w:fldSimple>
           </w:p>
           <w:p>
             <w:pPr>
-              <w:spacing w:before="0" w:after="20"/>
+              <w:spacing w:after="20"/>
               <w:ind w:left="198"/>
             </w:pPr>
             <w:r>
@@ -438,112 +452,126 @@
               <w:spacing w:before="0" w:after="20"/>
               <w:ind w:left="198"/>
             </w:pPr>
-            <w:r>
-              <w:rPr>
-                <w:rFonts w:ascii="Space Grotesk" w:hAnsi="Space Grotesk" w:cs="Space Grotesk"/>
-                <w:b/>
-                <w:i w:val="0"/>
-                <w:color w:val="07080C"/>
-                <w:sz w:val="24"/>
-              </w:rPr>
-              <w:t>«ContactName»</w:t>
-            </w:r>
+            <w:fldSimple w:instr=" MERGEFIELD  ContactName  \* MERGEFORMAT ">
+              <w:r>
+                <w:rPr>
+                  <w:rFonts w:ascii="Space Grotesk" w:hAnsi="Space Grotesk" w:cs="Space Grotesk"/>
+                  <w:b/>
+                  <w:i w:val="0"/>
+                  <w:color w:val="07080C"/>
+                  <w:sz w:val="24"/>
+                </w:rPr>
+                <w:t>«ContactName»</w:t>
+              </w:r>
+            </w:fldSimple>
           </w:p>
           <w:p>
             <w:pPr>
               <w:spacing w:before="0" w:after="20"/>
               <w:ind w:left="198"/>
             </w:pPr>
-            <w:r>
-              <w:rPr>
-                <w:rFonts w:ascii="Inter" w:hAnsi="Inter" w:cs="Inter"/>
-                <w:b w:val="0"/>
-                <w:i w:val="0"/>
-                <w:color w:val="525B6E"/>
-                <w:sz w:val="18"/>
-              </w:rPr>
-              <w:t>«ContactPhysicalAddressLine1»</w:t>
-            </w:r>
+            <w:fldSimple w:instr=" MERGEFIELD  ContactPhysicalAddressLine1  \* MERGEFORMAT ">
+              <w:r>
+                <w:rPr>
+                  <w:rFonts w:ascii="Inter" w:hAnsi="Inter" w:cs="Inter"/>
+                  <w:b w:val="0"/>
+                  <w:i w:val="0"/>
+                  <w:color w:val="525B6E"/>
+                  <w:sz w:val="18"/>
+                </w:rPr>
+                <w:t>«ContactPhysicalAddressLine1»</w:t>
+              </w:r>
+            </w:fldSimple>
           </w:p>
           <w:p>
             <w:pPr>
               <w:spacing w:before="0" w:after="20"/>
               <w:ind w:left="198"/>
             </w:pPr>
-            <w:r>
-              <w:rPr>
-                <w:rFonts w:ascii="Inter" w:hAnsi="Inter" w:cs="Inter"/>
-                <w:b w:val="0"/>
-                <w:i w:val="0"/>
-                <w:color w:val="525B6E"/>
-                <w:sz w:val="18"/>
-              </w:rPr>
-              <w:t>«ContactPhysicalAddressLine2»</w:t>
-            </w:r>
+            <w:fldSimple w:instr=" MERGEFIELD  ContactPhysicalAddressLine2  \* MERGEFORMAT ">
+              <w:r>
+                <w:rPr>
+                  <w:rFonts w:ascii="Inter" w:hAnsi="Inter" w:cs="Inter"/>
+                  <w:b w:val="0"/>
+                  <w:i w:val="0"/>
+                  <w:color w:val="525B6E"/>
+                  <w:sz w:val="18"/>
+                </w:rPr>
+                <w:t>«ContactPhysicalAddressLine2»</w:t>
+              </w:r>
+            </w:fldSimple>
           </w:p>
           <w:p>
             <w:pPr>
               <w:spacing w:before="0" w:after="20"/>
               <w:ind w:left="198"/>
             </w:pPr>
-            <w:r>
-              <w:rPr>
-                <w:rFonts w:ascii="Inter" w:hAnsi="Inter" w:cs="Inter"/>
-                <w:b w:val="0"/>
-                <w:i w:val="0"/>
-                <w:color w:val="525B6E"/>
-                <w:sz w:val="18"/>
-              </w:rPr>
-              <w:t>«ContactPhysicalAddressLine3»</w:t>
-            </w:r>
+            <w:fldSimple w:instr=" MERGEFIELD  ContactPhysicalAddressLine3  \* MERGEFORMAT ">
+              <w:r>
+                <w:rPr>
+                  <w:rFonts w:ascii="Inter" w:hAnsi="Inter" w:cs="Inter"/>
+                  <w:b w:val="0"/>
+                  <w:i w:val="0"/>
+                  <w:color w:val="525B6E"/>
+                  <w:sz w:val="18"/>
+                </w:rPr>
+                <w:t>«ContactPhysicalAddressLine3»</w:t>
+              </w:r>
+            </w:fldSimple>
           </w:p>
           <w:p>
             <w:pPr>
               <w:spacing w:before="0" w:after="20"/>
               <w:ind w:left="198"/>
             </w:pPr>
-            <w:r>
-              <w:rPr>
-                <w:rFonts w:ascii="Inter" w:hAnsi="Inter" w:cs="Inter"/>
-                <w:b w:val="0"/>
-                <w:i w:val="0"/>
-                <w:color w:val="525B6E"/>
-                <w:sz w:val="18"/>
-              </w:rPr>
-              <w:t>«ContactPhysicalAddressLine4»</w:t>
-            </w:r>
+            <w:fldSimple w:instr=" MERGEFIELD  ContactPhysicalAddressLine4  \* MERGEFORMAT ">
+              <w:r>
+                <w:rPr>
+                  <w:rFonts w:ascii="Inter" w:hAnsi="Inter" w:cs="Inter"/>
+                  <w:b w:val="0"/>
+                  <w:i w:val="0"/>
+                  <w:color w:val="525B6E"/>
+                  <w:sz w:val="18"/>
+                </w:rPr>
+                <w:t>«ContactPhysicalAddressLine4»</w:t>
+              </w:r>
+            </w:fldSimple>
           </w:p>
           <w:p>
             <w:pPr>
               <w:spacing w:before="0" w:after="20"/>
               <w:ind w:left="198"/>
             </w:pPr>
-            <w:r>
-              <w:rPr>
-                <w:rFonts w:ascii="Inter" w:hAnsi="Inter" w:cs="Inter"/>
-                <w:b w:val="0"/>
-                <w:i w:val="0"/>
-                <w:color w:val="525B6E"/>
-                <w:sz w:val="18"/>
-              </w:rPr>
-              <w:t>«ContactPhysicalPostalCode»</w:t>
-            </w:r>
+            <w:fldSimple w:instr=" MERGEFIELD  ContactPhysicalPostalCode  \* MERGEFORMAT ">
+              <w:r>
+                <w:rPr>
+                  <w:rFonts w:ascii="Inter" w:hAnsi="Inter" w:cs="Inter"/>
+                  <w:b w:val="0"/>
+                  <w:i w:val="0"/>
+                  <w:color w:val="525B6E"/>
+                  <w:sz w:val="18"/>
+                </w:rPr>
+                <w:t>«ContactPhysicalPostalCode»</w:t>
+              </w:r>
+            </w:fldSimple>
           </w:p>
           <w:p>
             <w:pPr>
               <w:spacing w:before="0" w:after="20"/>
               <w:ind w:left="198"/>
             </w:pPr>
-            <w:r>
-              <w:rPr>
-                <w:rFonts w:ascii="Inter" w:hAnsi="Inter" w:cs="Inter"/>
-                <w:b w:val="0"/>
-                <w:i w:val="0"/>
-                <w:color w:val="525B6E"/>
-                <w:sz w:val="18"/>
-              </w:rPr>
-              <w:t>«ContactPhysicalCountry»</w:t>
-            </w:r>
+            <w:fldSimple w:instr=" MERGEFIELD  ContactPhysicalCountry  \* MERGEFORMAT ">
+              <w:r>
+                <w:rPr>
+                  <w:rFonts w:ascii="Inter" w:hAnsi="Inter" w:cs="Inter"/>
+                  <w:b w:val="0"/>
+                  <w:i w:val="0"/>
+                  <w:color w:val="525B6E"/>
+                  <w:sz w:val="18"/>
+                </w:rPr>
+                <w:t>«ContactPhysicalCountry»</w:t>
+              </w:r>
+            </w:fldSimple>
           </w:p>
           <w:p>
             <w:pPr>
@@ -565,16 +593,18 @@
               <w:spacing w:before="0" w:after="20"/>
               <w:ind w:left="198"/>
             </w:pPr>
-            <w:r>
-              <w:rPr>
-                <w:rFonts w:ascii="Inter" w:hAnsi="Inter" w:cs="Inter"/>
-                <w:b w:val="0"/>
-                <w:i w:val="0"/>
-                <w:color w:val="07080C"/>
-                <w:sz w:val="18"/>
-              </w:rPr>
-              <w:t>«ContactEmailAddress»</w:t>
-            </w:r>
+            <w:fldSimple w:instr=" MERGEFIELD  ContactEmailAddress  \* MERGEFORMAT ">
+              <w:r>
+                <w:rPr>
+                  <w:rFonts w:ascii="Inter" w:hAnsi="Inter" w:cs="Inter"/>
+                  <w:b w:val="0"/>
+                  <w:i w:val="0"/>
+                  <w:color w:val="07080C"/>
+                  <w:sz w:val="18"/>
+                </w:rPr>
+                <w:t>«ContactEmailAddress»</w:t>
+              </w:r>
+            </w:fldSimple>
           </w:p>
           <w:p>
             <w:pPr>
@@ -702,16 +732,18 @@
               <w:spacing w:before="0" w:after="120"/>
               <w:ind w:left="198"/>
             </w:pPr>
-            <w:r>
-              <w:rPr>
-                <w:rFonts w:ascii="Space Grotesk" w:hAnsi="Space Grotesk" w:cs="Space Grotesk"/>
-                <w:b/>
-                <w:i w:val="0"/>
-                <w:color w:val="07080C"/>
-                <w:sz w:val="24"/>
-              </w:rPr>
-              <w:t>«Date»</w:t>
-            </w:r>
+            <w:fldSimple w:instr=" MERGEFIELD  Date  \* MERGEFORMAT ">
+              <w:r>
+                <w:rPr>
+                  <w:rFonts w:ascii="Space Grotesk" w:hAnsi="Space Grotesk" w:cs="Space Grotesk"/>
+                  <w:b/>
+                  <w:i w:val="0"/>
+                  <w:color w:val="07080C"/>
+                  <w:sz w:val="24"/>
+                </w:rPr>
+                <w:t>«Date»</w:t>
+              </w:r>
+            </w:fldSimple>
           </w:p>
         </w:tc>
         <w:tc>
@@ -727,16 +759,18 @@
               <w:spacing w:before="0" w:after="120"/>
               <w:ind w:left="198"/>
             </w:pPr>
-            <w:r>
-              <w:rPr>
-                <w:rFonts w:ascii="Space Grotesk" w:hAnsi="Space Grotesk" w:cs="Space Grotesk"/>
-                <w:b/>
-                <w:i w:val="0"/>
-                <w:color w:val="07080C"/>
-                <w:sz w:val="24"/>
-              </w:rPr>
-              <w:t>«DueDate»</w:t>
-            </w:r>
+            <w:fldSimple w:instr=" MERGEFIELD  DueDate  \* MERGEFORMAT ">
+              <w:r>
+                <w:rPr>
+                  <w:rFonts w:ascii="Space Grotesk" w:hAnsi="Space Grotesk" w:cs="Space Grotesk"/>
+                  <w:b/>
+                  <w:i w:val="0"/>
+                  <w:color w:val="07080C"/>
+                  <w:sz w:val="24"/>
+                </w:rPr>
+                <w:t>«DueDate»</w:t>
+              </w:r>
+            </w:fldSimple>
           </w:p>
         </w:tc>
         <w:tc>
@@ -752,16 +786,18 @@
               <w:spacing w:before="0" w:after="120"/>
               <w:ind w:left="198"/>
             </w:pPr>
-            <w:r>
-              <w:rPr>
-                <w:rFonts w:ascii="Space Grotesk" w:hAnsi="Space Grotesk" w:cs="Space Grotesk"/>
-                <w:b/>
-                <w:i w:val="0"/>
-                <w:color w:val="07080C"/>
-                <w:sz w:val="24"/>
-              </w:rPr>
-              <w:t>«Reference»</w:t>
-            </w:r>
+            <w:fldSimple w:instr=" MERGEFIELD  Reference  \* MERGEFORMAT ">
+              <w:r>
+                <w:rPr>
+                  <w:rFonts w:ascii="Space Grotesk" w:hAnsi="Space Grotesk" w:cs="Space Grotesk"/>
+                  <w:b/>
+                  <w:i w:val="0"/>
+                  <w:color w:val="07080C"/>
+                  <w:sz w:val="24"/>
+                </w:rPr>
+                <w:t>«Reference»</w:t>
+              </w:r>
+            </w:fldSimple>
           </w:p>
         </w:tc>
       </w:tr>
@@ -921,16 +957,18 @@
               <w:ind w:left="142" w:right="0"/>
               <w:jc w:val="left"/>
             </w:pPr>
-            <w:r>
-              <w:rPr>
-                <w:rFonts w:ascii="Inter" w:hAnsi="Inter" w:cs="Inter"/>
-                <w:b w:val="0"/>
-                <w:i w:val="0"/>
-                <w:color w:val="07080C"/>
-                <w:sz w:val="20"/>
-              </w:rPr>
-              <w:t>«Description»</w:t>
-            </w:r>
+            <w:fldSimple w:instr=" MERGEFIELD  Description  \* MERGEFORMAT ">
+              <w:r>
+                <w:rPr>
+                  <w:rFonts w:ascii="Inter" w:hAnsi="Inter" w:cs="Inter"/>
+                  <w:b w:val="0"/>
+                  <w:i w:val="0"/>
+                  <w:color w:val="07080C"/>
+                  <w:sz w:val="20"/>
+                </w:rPr>
+                <w:t>«Description»</w:t>
+              </w:r>
+            </w:fldSimple>
           </w:p>
         </w:tc>
         <w:tc>
@@ -948,16 +986,18 @@
               <w:ind w:left="0" w:right="142"/>
               <w:jc w:val="right"/>
             </w:pPr>
-            <w:r>
-              <w:rPr>
-                <w:rFonts w:ascii="JetBrains Mono" w:hAnsi="JetBrains Mono" w:cs="JetBrains Mono"/>
-                <w:b w:val="0"/>
-                <w:i w:val="0"/>
-                <w:color w:val="525B6E"/>
-                <w:sz w:val="20"/>
-              </w:rPr>
-              <w:t>«Quantity»</w:t>
-            </w:r>
+            <w:fldSimple w:instr=" MERGEFIELD  Quantity  \* MERGEFORMAT ">
+              <w:r>
+                <w:rPr>
+                  <w:rFonts w:ascii="JetBrains Mono" w:hAnsi="JetBrains Mono" w:cs="JetBrains Mono"/>
+                  <w:b w:val="0"/>
+                  <w:i w:val="0"/>
+                  <w:color w:val="525B6E"/>
+                  <w:sz w:val="20"/>
+                </w:rPr>
+                <w:t>«Quantity»</w:t>
+              </w:r>
+            </w:fldSimple>
           </w:p>
         </w:tc>
         <w:tc>
@@ -975,16 +1015,18 @@
               <w:ind w:left="0" w:right="142"/>
               <w:jc w:val="right"/>
             </w:pPr>
-            <w:r>
-              <w:rPr>
-                <w:rFonts w:ascii="JetBrains Mono" w:hAnsi="JetBrains Mono" w:cs="JetBrains Mono"/>
-                <w:b w:val="0"/>
-                <w:i w:val="0"/>
-                <w:color w:val="525B6E"/>
-                <w:sz w:val="20"/>
-              </w:rPr>
-              <w:t>«UnitAmount»</w:t>
-            </w:r>
+            <w:fldSimple w:instr=" MERGEFIELD  UnitAmount  \* MERGEFORMAT ">
+              <w:r>
+                <w:rPr>
+                  <w:rFonts w:ascii="JetBrains Mono" w:hAnsi="JetBrains Mono" w:cs="JetBrains Mono"/>
+                  <w:b w:val="0"/>
+                  <w:i w:val="0"/>
+                  <w:color w:val="525B6E"/>
+                  <w:sz w:val="20"/>
+                </w:rPr>
+                <w:t>«UnitAmount»</w:t>
+              </w:r>
+            </w:fldSimple>
           </w:p>
         </w:tc>
         <w:tc>
@@ -1002,16 +1044,18 @@
               <w:ind w:left="0" w:right="142"/>
               <w:jc w:val="right"/>
             </w:pPr>
-            <w:r>
-              <w:rPr>
-                <w:rFonts w:ascii="Space Grotesk" w:hAnsi="Space Grotesk" w:cs="Space Grotesk"/>
-                <w:b/>
-                <w:i w:val="0"/>
-                <w:color w:val="07080C"/>
-                <w:sz w:val="22"/>
-              </w:rPr>
-              <w:t>«LineAmount»</w:t>
-            </w:r>
+            <w:fldSimple w:instr=" MERGEFIELD  LineAmount  \* MERGEFORMAT ">
+              <w:r>
+                <w:rPr>
+                  <w:rFonts w:ascii="Space Grotesk" w:hAnsi="Space Grotesk" w:cs="Space Grotesk"/>
+                  <w:b/>
+                  <w:i w:val="0"/>
+                  <w:color w:val="07080C"/>
+                  <w:sz w:val="22"/>
+                </w:rPr>
+                <w:t>«LineAmount»</w:t>
+              </w:r>
+            </w:fldSimple>
           </w:p>
         </w:tc>
       </w:tr>
@@ -1078,7 +1122,7 @@
                 <w:color w:val="07080C"/>
                 <w:sz w:val="22"/>
               </w:rPr>
-              <w:t>Bank transfer</w:t>
+              <w:t>Bank transfer · Monzo</w:t>
             </w:r>
           </w:p>
           <w:p>
@@ -1110,7 +1154,7 @@
                 <w:color w:val="525B6E"/>
                 <w:sz w:val="18"/>
               </w:rPr>
-              <w:t>Sort code · [YOUR SORT CODE]</w:t>
+              <w:t>Sort code · 04-00-04</w:t>
             </w:r>
           </w:p>
           <w:p>
@@ -1126,7 +1170,7 @@
                 <w:color w:val="525B6E"/>
                 <w:sz w:val="18"/>
               </w:rPr>
-              <w:t>Account · [YOUR ACCOUNT NUMBER]</w:t>
+              <w:t>Account · 65693471</w:t>
             </w:r>
           </w:p>
           <w:p>
@@ -1142,12 +1186,24 @@
                 <w:color w:val="525B6E"/>
                 <w:sz w:val="18"/>
               </w:rPr>
-              <w:t>Reference · «InvoiceNumber»</w:t>
+              <w:t xml:space="preserve">Reference · </w:t>
             </w:r>
+            <w:fldSimple w:instr=" MERGEFIELD  InvoiceNumber  \* MERGEFORMAT ">
+              <w:r>
+                <w:rPr>
+                  <w:rFonts w:ascii="Inter" w:hAnsi="Inter" w:cs="Inter"/>
+                  <w:b w:val="0"/>
+                  <w:i w:val="0"/>
+                  <w:color w:val="525B6E"/>
+                  <w:sz w:val="18"/>
+                </w:rPr>
+                <w:t>«InvoiceNumber»</w:t>
+              </w:r>
+            </w:fldSimple>
           </w:p>
           <w:p>
             <w:pPr>
-              <w:spacing w:before="0" w:after="20"/>
+              <w:spacing w:after="20"/>
               <w:ind w:left="198"/>
             </w:pPr>
             <w:r>
@@ -1173,7 +1229,29 @@
                 <w:color w:val="8B94A8"/>
                 <w:sz w:val="16"/>
               </w:rPr>
-              <w:t>Payment terms · «PaymentTerms» days from invoice date.</w:t>
+              <w:t xml:space="preserve">Payment terms · </w:t>
+            </w:r>
+            <w:fldSimple w:instr=" MERGEFIELD  PaymentTerms  \* MERGEFORMAT ">
+              <w:r>
+                <w:rPr>
+                  <w:rFonts w:ascii="Inter" w:hAnsi="Inter" w:cs="Inter"/>
+                  <w:b w:val="0"/>
+                  <w:i w:val="0"/>
+                  <w:color w:val="8B94A8"/>
+                  <w:sz w:val="16"/>
+                </w:rPr>
+                <w:t>«PaymentTerms»</w:t>
+              </w:r>
+            </w:fldSimple>
+            <w:r>
+              <w:rPr>
+                <w:rFonts w:ascii="Inter" w:hAnsi="Inter" w:cs="Inter"/>
+                <w:b w:val="0"/>
+                <w:i w:val="0"/>
+                <w:color w:val="8B94A8"/>
+                <w:sz w:val="16"/>
+              </w:rPr>
+              <w:t xml:space="preserve"> days from invoice date.</w:t>
             </w:r>
           </w:p>
           <w:p>
@@ -1246,7 +1324,7 @@
               <w:tabs>
                 <w:tab w:pos="3798" w:val="right"/>
               </w:tabs>
-              <w:spacing w:before="0" w:after="60"/>
+              <w:spacing w:before="160" w:after="60"/>
               <w:ind w:left="198" w:right="198"/>
             </w:pPr>
             <w:r>
@@ -1269,16 +1347,18 @@
               </w:rPr>
               <w:tab/>
             </w:r>
-            <w:r>
-              <w:rPr>
-                <w:rFonts w:ascii="JetBrains Mono" w:hAnsi="JetBrains Mono" w:cs="JetBrains Mono"/>
-                <w:b w:val="0"/>
-                <w:i w:val="0"/>
-                <w:color w:val="07080C"/>
-                <w:sz w:val="20"/>
-              </w:rPr>
-              <w:t>«SubTotal»</w:t>
-            </w:r>
+            <w:fldSimple w:instr=" MERGEFIELD  SubTotal  \* MERGEFORMAT ">
+              <w:r>
+                <w:rPr>
+                  <w:rFonts w:ascii="JetBrains Mono" w:hAnsi="JetBrains Mono" w:cs="JetBrains Mono"/>
+                  <w:b w:val="0"/>
+                  <w:i w:val="0"/>
+                  <w:color w:val="07080C"/>
+                  <w:sz w:val="20"/>
+                </w:rPr>
+                <w:t>«SubTotal»</w:t>
+              </w:r>
+            </w:fldSimple>
           </w:p>
           <w:p>
             <w:pPr>
@@ -1308,16 +1388,18 @@
               </w:rPr>
               <w:tab/>
             </w:r>
-            <w:r>
-              <w:rPr>
-                <w:rFonts w:ascii="JetBrains Mono" w:hAnsi="JetBrains Mono" w:cs="JetBrains Mono"/>
-                <w:b w:val="0"/>
-                <w:i w:val="0"/>
-                <w:color w:val="07080C"/>
-                <w:sz w:val="20"/>
-              </w:rPr>
-              <w:t>«TotalTax»</w:t>
-            </w:r>
+            <w:fldSimple w:instr=" MERGEFIELD  TotalTax  \* MERGEFORMAT ">
+              <w:r>
+                <w:rPr>
+                  <w:rFonts w:ascii="JetBrains Mono" w:hAnsi="JetBrains Mono" w:cs="JetBrains Mono"/>
+                  <w:b w:val="0"/>
+                  <w:i w:val="0"/>
+                  <w:color w:val="07080C"/>
+                  <w:sz w:val="20"/>
+                </w:rPr>
+                <w:t>«TotalTax»</w:t>
+              </w:r>
+            </w:fldSimple>
           </w:p>
           <w:p>
             <w:pPr>
@@ -1347,16 +1429,18 @@
               </w:rPr>
               <w:tab/>
             </w:r>
-            <w:r>
-              <w:rPr>
-                <w:rFonts w:ascii="JetBrains Mono" w:hAnsi="JetBrains Mono" w:cs="JetBrains Mono"/>
-                <w:b w:val="0"/>
-                <w:i w:val="0"/>
-                <w:color w:val="07080C"/>
-                <w:sz w:val="20"/>
-              </w:rPr>
-              <w:t>«AmountPaid»</w:t>
-            </w:r>
+            <w:fldSimple w:instr=" MERGEFIELD  AmountPaid  \* MERGEFORMAT ">
+              <w:r>
+                <w:rPr>
+                  <w:rFonts w:ascii="JetBrains Mono" w:hAnsi="JetBrains Mono" w:cs="JetBrains Mono"/>
+                  <w:b w:val="0"/>
+                  <w:i w:val="0"/>
+                  <w:color w:val="07080C"/>
+                  <w:sz w:val="20"/>
+                </w:rPr>
+                <w:t>«AmountPaid»</w:t>
+              </w:r>
+            </w:fldSimple>
           </w:p>
           <w:p>
             <w:pPr>
@@ -1390,16 +1474,18 @@
               <w:ind w:left="198" w:right="198"/>
               <w:jc w:val="right"/>
             </w:pPr>
-            <w:r>
-              <w:rPr>
-                <w:rFonts w:ascii="Space Grotesk" w:hAnsi="Space Grotesk" w:cs="Space Grotesk"/>
-                <w:b/>
-                <w:i w:val="0"/>
-                <w:color w:val="07080C"/>
-                <w:sz w:val="40"/>
-              </w:rPr>
-              <w:t>«AmountDue»</w:t>
-            </w:r>
+            <w:fldSimple w:instr=" MERGEFIELD  AmountDue  \* MERGEFORMAT ">
+              <w:r>
+                <w:rPr>
+                  <w:rFonts w:ascii="Space Grotesk" w:hAnsi="Space Grotesk" w:cs="Space Grotesk"/>
+                  <w:b/>
+                  <w:i w:val="0"/>
+                  <w:color w:val="07080C"/>
+                  <w:sz w:val="40"/>
+                </w:rPr>
+                <w:t>«AmountDue»</w:t>
+              </w:r>
+            </w:fldSimple>
           </w:p>
         </w:tc>
       </w:tr>

</xml_diff>

<commit_message>
Xero invoice: fix TableStart placement + add format switches
Xero rejected the previous template with "Invoice PDF failed to
download". Cause: TableStart:LineItem was in the header row (row 1)
while TableEnd:LineItem was in the body row (row 2). Xero needs both
markers in the SAME row so it can identify which row to repeat per
line item. Moved TableStart into the body row's first cell alongside
the Description merge field, so both markers now live in row 2.

Also added Word merge-field format switches so values render in the
right shape at PDF time:
  - Dates           \@ "dd MMM yyyy"      → "21 Apr 2026"
  - Quantity        \# #,##0.##           → "2.5"
  - Currency fields \# "#,##0.00;(#,##0.00)"  → "1,750.00"

Without the switches Xero was passing raw ISO dates and unformatted
numbers, which is what the previous test invoice showed for the fields
that did merge.

Co-Authored-By: Claude Opus 4.7 (1M context) <noreply@anthropic.com>
</commit_message>
<xml_diff>
--- a/xero/webgro-invoice-template.docx
+++ b/xero/webgro-invoice-template.docx
@@ -642,7 +642,7 @@
               <w:spacing w:before="0" w:after="120"/>
               <w:ind w:left="198"/>
             </w:pPr>
-            <w:fldSimple w:instr=" MERGEFIELD  InvoiceDate  \* MERGEFORMAT ">
+            <w:fldSimple w:instr=" MERGEFIELD  InvoiceDate  \@ &quot;dd MMM yyyy&quot;  \* MERGEFORMAT ">
               <w:r>
                 <w:rPr>
                   <w:rFonts w:ascii="Trebuchet MS" w:hAnsi="Trebuchet MS" w:cs="Trebuchet MS"/>
@@ -669,7 +669,7 @@
               <w:spacing w:before="0" w:after="120"/>
               <w:ind w:left="198"/>
             </w:pPr>
-            <w:fldSimple w:instr=" MERGEFIELD  InvoiceDueDate  \* MERGEFORMAT ">
+            <w:fldSimple w:instr=" MERGEFIELD  InvoiceDueDate  \@ &quot;dd MMM yyyy&quot;  \* MERGEFORMAT ">
               <w:r>
                 <w:rPr>
                   <w:rFonts w:ascii="Trebuchet MS" w:hAnsi="Trebuchet MS" w:cs="Trebuchet MS"/>
@@ -753,18 +753,6 @@
               <w:ind w:left="142" w:right="0"/>
               <w:jc w:val="left"/>
             </w:pPr>
-            <w:fldSimple w:instr=" MERGEFIELD  TableStart:LineItem  \* MERGEFORMAT ">
-              <w:r>
-                <w:rPr>
-                  <w:rFonts w:ascii="Consolas" w:hAnsi="Consolas" w:cs="Consolas"/>
-                  <w:b w:val="0"/>
-                  <w:i w:val="0"/>
-                  <w:color w:val="FFFFFF"/>
-                  <w:sz w:val="2"/>
-                </w:rPr>
-                <w:t>«TableStart:LineItem»</w:t>
-              </w:r>
-            </w:fldSimple>
             <w:r>
               <w:rPr>
                 <w:rFonts w:ascii="Consolas" w:hAnsi="Consolas" w:cs="Consolas"/>
@@ -879,6 +867,18 @@
               <w:ind w:left="142" w:right="0"/>
               <w:jc w:val="left"/>
             </w:pPr>
+            <w:fldSimple w:instr=" MERGEFIELD  TableStart:LineItem  \* MERGEFORMAT ">
+              <w:r>
+                <w:rPr>
+                  <w:rFonts w:ascii="Consolas" w:hAnsi="Consolas" w:cs="Consolas"/>
+                  <w:b w:val="0"/>
+                  <w:i w:val="0"/>
+                  <w:color w:val="FFFFFF"/>
+                  <w:sz w:val="2"/>
+                </w:rPr>
+                <w:t>«TableStart:LineItem»</w:t>
+              </w:r>
+            </w:fldSimple>
             <w:fldSimple w:instr=" MERGEFIELD  Description  \* MERGEFORMAT ">
               <w:r>
                 <w:rPr>
@@ -908,7 +908,7 @@
               <w:ind w:left="0" w:right="142"/>
               <w:jc w:val="right"/>
             </w:pPr>
-            <w:fldSimple w:instr=" MERGEFIELD  Quantity  \* MERGEFORMAT ">
+            <w:fldSimple w:instr=" MERGEFIELD  Quantity  \# #,##0.##  \* MERGEFORMAT ">
               <w:r>
                 <w:rPr>
                   <w:rFonts w:ascii="Consolas" w:hAnsi="Consolas" w:cs="Consolas"/>
@@ -937,7 +937,7 @@
               <w:ind w:left="0" w:right="142"/>
               <w:jc w:val="right"/>
             </w:pPr>
-            <w:fldSimple w:instr=" MERGEFIELD  UnitAmount  \* MERGEFORMAT ">
+            <w:fldSimple w:instr=" MERGEFIELD  UnitAmount  \# &quot;#,##0.00;(#,##0.00)&quot;  \* MERGEFORMAT ">
               <w:r>
                 <w:rPr>
                   <w:rFonts w:ascii="Consolas" w:hAnsi="Consolas" w:cs="Consolas"/>
@@ -966,7 +966,7 @@
               <w:ind w:left="0" w:right="142"/>
               <w:jc w:val="right"/>
             </w:pPr>
-            <w:fldSimple w:instr=" MERGEFIELD  LineAmount  \* MERGEFORMAT ">
+            <w:fldSimple w:instr=" MERGEFIELD  LineAmount  \# &quot;#,##0.00;(#,##0.00)&quot;  \* MERGEFORMAT ">
               <w:r>
                 <w:rPr>
                   <w:rFonts w:ascii="Trebuchet MS" w:hAnsi="Trebuchet MS" w:cs="Trebuchet MS"/>
@@ -1243,7 +1243,7 @@
               </w:rPr>
               <w:tab/>
             </w:r>
-            <w:fldSimple w:instr=" MERGEFIELD  InvoiceSubTotal  \* MERGEFORMAT ">
+            <w:fldSimple w:instr=" MERGEFIELD  InvoiceSubTotal  \# &quot;#,##0.00;(#,##0.00)&quot;  \* MERGEFORMAT ">
               <w:r>
                 <w:rPr>
                   <w:rFonts w:ascii="Consolas" w:hAnsi="Consolas" w:cs="Consolas"/>
@@ -1284,7 +1284,7 @@
               </w:rPr>
               <w:tab/>
             </w:r>
-            <w:fldSimple w:instr=" MERGEFIELD  TaxTotal  \* MERGEFORMAT ">
+            <w:fldSimple w:instr=" MERGEFIELD  TaxTotal  \# &quot;#,##0.00;(#,##0.00)&quot;  \* MERGEFORMAT ">
               <w:r>
                 <w:rPr>
                   <w:rFonts w:ascii="Consolas" w:hAnsi="Consolas" w:cs="Consolas"/>
@@ -1329,7 +1329,7 @@
               <w:ind w:left="198" w:right="198"/>
               <w:jc w:val="right"/>
             </w:pPr>
-            <w:fldSimple w:instr=" MERGEFIELD  InvoiceAmountDue  \* MERGEFORMAT ">
+            <w:fldSimple w:instr=" MERGEFIELD  InvoiceAmountDue  \# &quot;#,##0.00;(#,##0.00)&quot;  \* MERGEFORMAT ">
               <w:r>
                 <w:rPr>
                   <w:rFonts w:ascii="Trebuchet MS" w:hAnsi="Trebuchet MS" w:cs="Trebuchet MS"/>

</xml_diff>

<commit_message>
Xero invoice: fix TaxTotal + full-width Thanks + tightened FROM block
- TaxTotal was rendering as «TaxTotal» because Xero requires it inside
  a TableStart:TaxSubTotal / TableEnd:TaxSubTotal repeater (invoices
  can carry multiple tax rates). Wrapped the VAT line in a nested
  one-row table carrying both markers, so TaxTotal now merges.
- Removed email + phone lines from the FROM cell to tighten the
  header; same contact details now live in the Thanks block below.
- Thanks section pulled out of the left payment card and rebuilt as
  a full-width paragraph group on the cream page, giving it room to
  breathe and matching the look of the rest of the site chrome.

Co-Authored-By: Claude Opus 4.7 (1M context) <noreply@anthropic.com>
</commit_message>
<xml_diff>
--- a/xero/webgro-invoice-template.docx
+++ b/xero/webgro-invoice-template.docx
@@ -368,53 +368,6 @@
                 <w:t>«OrganisationTaxNumber»</w:t>
               </w:r>
             </w:fldSimple>
-          </w:p>
-          <w:p>
-            <w:pPr>
-              <w:spacing w:after="20"/>
-              <w:ind w:left="198"/>
-            </w:pPr>
-            <w:r>
-              <w:rPr>
-                <w:rFonts w:ascii="Calibri" w:hAnsi="Calibri" w:cs="Calibri"/>
-                <w:b w:val="0"/>
-                <w:i w:val="0"/>
-                <w:color w:val="07080C"/>
-                <w:sz w:val="8"/>
-              </w:rPr>
-            </w:r>
-          </w:p>
-          <w:p>
-            <w:pPr>
-              <w:spacing w:before="0" w:after="20"/>
-              <w:ind w:left="198"/>
-            </w:pPr>
-            <w:r>
-              <w:rPr>
-                <w:rFonts w:ascii="Calibri" w:hAnsi="Calibri" w:cs="Calibri"/>
-                <w:b w:val="0"/>
-                <w:i w:val="0"/>
-                <w:color w:val="07080C"/>
-                <w:sz w:val="18"/>
-              </w:rPr>
-              <w:t>hello@webgro.co.uk</w:t>
-            </w:r>
-          </w:p>
-          <w:p>
-            <w:pPr>
-              <w:spacing w:before="0" w:after="20"/>
-              <w:ind w:left="198"/>
-            </w:pPr>
-            <w:r>
-              <w:rPr>
-                <w:rFonts w:ascii="Calibri" w:hAnsi="Calibri" w:cs="Calibri"/>
-                <w:b w:val="0"/>
-                <w:i w:val="0"/>
-                <w:color w:val="07080C"/>
-                <w:sz w:val="18"/>
-              </w:rPr>
-              <w:t>+44 (0) 1344 231 119</w:t>
-            </w:r>
           </w:p>
           <w:p>
             <w:pPr>
@@ -1152,61 +1105,8 @@
           </w:p>
           <w:p>
             <w:pPr>
-              <w:spacing w:before="120" w:after="80"/>
-              <w:ind w:left="198" w:right="198"/>
-              <w:pBdr>
-                <w:bottom w:val="single" w:sz="4" w:space="1" w:color="E6EAF2"/>
-              </w:pBdr>
+              <w:spacing w:after="160"/>
             </w:pPr>
-          </w:p>
-          <w:p>
-            <w:pPr>
-              <w:spacing w:before="40" w:after="40"/>
-              <w:ind w:left="198"/>
-            </w:pPr>
-            <w:r>
-              <w:rPr>
-                <w:rFonts w:ascii="Trebuchet MS" w:hAnsi="Trebuchet MS" w:cs="Trebuchet MS"/>
-                <w:b/>
-                <w:i/>
-                <w:color w:val="07080C"/>
-                <w:sz w:val="44"/>
-              </w:rPr>
-              <w:t>Thanks.</w:t>
-            </w:r>
-          </w:p>
-          <w:p>
-            <w:pPr>
-              <w:spacing w:before="40" w:after="40"/>
-              <w:ind w:left="198" w:right="198"/>
-            </w:pPr>
-            <w:r>
-              <w:rPr>
-                <w:rFonts w:ascii="Calibri" w:hAnsi="Calibri" w:cs="Calibri"/>
-                <w:b w:val="0"/>
-                <w:i w:val="0"/>
-                <w:color w:val="525B6E"/>
-                <w:sz w:val="16"/>
-              </w:rPr>
-              <w:t>Questions or changes? Email hello@webgro.co.uk and we'll sort it.</w:t>
-            </w:r>
-          </w:p>
-          <w:p>
-            <w:pPr>
-              <w:spacing w:before="120" w:after="160"/>
-              <w:ind w:left="198" w:right="198"/>
-            </w:pPr>
-            <w:r>
-              <w:rPr>
-                <w:rFonts w:ascii="Consolas" w:hAnsi="Consolas" w:cs="Consolas"/>
-                <w:b w:val="0"/>
-                <w:i w:val="0"/>
-                <w:color w:val="8B94A8"/>
-                <w:sz w:val="14"/>
-                <w:spacing w:val="24"/>
-              </w:rPr>
-              <w:t>WEBGRO LTD  ·  REG 10889889  ·  PART OF BROADBRIDGE GROUP</w:t>
-            </w:r>
           </w:p>
         </w:tc>
         <w:tc>
@@ -1256,47 +1156,98 @@
               </w:r>
             </w:fldSimple>
           </w:p>
-          <w:p>
-            <w:pPr>
-              <w:tabs>
-                <w:tab w:pos="3798" w:val="right"/>
-              </w:tabs>
-              <w:spacing w:before="0" w:after="60"/>
-              <w:ind w:left="198" w:right="198"/>
-            </w:pPr>
-            <w:r>
-              <w:rPr>
-                <w:rFonts w:ascii="Calibri" w:hAnsi="Calibri" w:cs="Calibri"/>
-                <w:b w:val="0"/>
-                <w:i w:val="0"/>
-                <w:color w:val="525B6E"/>
-                <w:sz w:val="18"/>
-              </w:rPr>
-              <w:t>VAT</w:t>
-            </w:r>
-            <w:r>
-              <w:rPr>
-                <w:rFonts w:ascii="Calibri" w:hAnsi="Calibri" w:cs="Calibri"/>
-                <w:b w:val="0"/>
-                <w:i w:val="0"/>
-                <w:color w:val="07080C"/>
-                <w:sz w:val="18"/>
-              </w:rPr>
-              <w:tab/>
-            </w:r>
-            <w:fldSimple w:instr=" MERGEFIELD  TaxTotal  \# &quot;#,##0.00;(#,##0.00)&quot;  \* MERGEFORMAT ">
-              <w:r>
-                <w:rPr>
-                  <w:rFonts w:ascii="Consolas" w:hAnsi="Consolas" w:cs="Consolas"/>
-                  <w:b w:val="0"/>
-                  <w:i w:val="0"/>
-                  <w:color w:val="07080C"/>
-                  <w:sz w:val="20"/>
-                </w:rPr>
-                <w:t>«TaxTotal»</w:t>
-              </w:r>
-            </w:fldSimple>
-          </w:p>
+          <w:tbl>
+            <w:tblPr>
+              <w:tblW w:type="auto" w:w="0"/>
+              <w:tblLayout w:type="fixed"/>
+              <w:tblLook w:firstColumn="1" w:firstRow="1" w:lastColumn="0" w:lastRow="0" w:noHBand="0" w:noVBand="1" w:val="04A0"/>
+              <w:tblBorders>
+                <w:top w:val="nil"/>
+                <w:left w:val="nil"/>
+                <w:bottom w:val="nil"/>
+                <w:right w:val="nil"/>
+                <w:insideH w:val="nil"/>
+                <w:insideV w:val="nil"/>
+              </w:tblBorders>
+            </w:tblPr>
+            <w:tblGrid>
+              <w:gridCol w:w="4252"/>
+            </w:tblGrid>
+            <w:tr>
+              <w:tc>
+                <w:tcPr>
+                  <w:tcW w:type="dxa" w:w="4252"/>
+                  <w:shd w:val="clear" w:color="auto" w:fill="FFFFFF"/>
+                </w:tcPr>
+                <w:p>
+                  <w:pPr>
+                    <w:tabs>
+                      <w:tab w:pos="3798" w:val="right"/>
+                    </w:tabs>
+                    <w:spacing w:before="0" w:after="60"/>
+                    <w:ind w:left="198" w:right="198"/>
+                  </w:pPr>
+                  <w:fldSimple w:instr=" MERGEFIELD  TableStart:TaxSubTotal  \* MERGEFORMAT ">
+                    <w:r>
+                      <w:rPr>
+                        <w:rFonts w:ascii="Consolas" w:hAnsi="Consolas" w:cs="Consolas"/>
+                        <w:b w:val="0"/>
+                        <w:i w:val="0"/>
+                        <w:color w:val="FFFFFF"/>
+                        <w:sz w:val="2"/>
+                      </w:rPr>
+                      <w:t>«TableStart:TaxSubTotal»</w:t>
+                    </w:r>
+                  </w:fldSimple>
+                  <w:r>
+                    <w:rPr>
+                      <w:rFonts w:ascii="Calibri" w:hAnsi="Calibri" w:cs="Calibri"/>
+                      <w:b w:val="0"/>
+                      <w:i w:val="0"/>
+                      <w:color w:val="525B6E"/>
+                      <w:sz w:val="18"/>
+                    </w:rPr>
+                    <w:t>VAT</w:t>
+                  </w:r>
+                  <w:r>
+                    <w:rPr>
+                      <w:rFonts w:ascii="Calibri" w:hAnsi="Calibri" w:cs="Calibri"/>
+                      <w:b w:val="0"/>
+                      <w:i w:val="0"/>
+                      <w:color w:val="07080C"/>
+                      <w:sz w:val="18"/>
+                    </w:rPr>
+                    <w:tab/>
+                  </w:r>
+                  <w:fldSimple w:instr=" MERGEFIELD  TaxTotal  \# &quot;#,##0.00;(#,##0.00)&quot;  \* MERGEFORMAT ">
+                    <w:r>
+                      <w:rPr>
+                        <w:rFonts w:ascii="Consolas" w:hAnsi="Consolas" w:cs="Consolas"/>
+                        <w:b w:val="0"/>
+                        <w:i w:val="0"/>
+                        <w:color w:val="07080C"/>
+                        <w:sz w:val="20"/>
+                      </w:rPr>
+                      <w:t>«TaxTotal»</w:t>
+                    </w:r>
+                  </w:fldSimple>
+                  <w:fldSimple w:instr=" MERGEFIELD  TableEnd:TaxSubTotal  \* MERGEFORMAT ">
+                    <w:r>
+                      <w:rPr>
+                        <w:rFonts w:ascii="Consolas" w:hAnsi="Consolas" w:cs="Consolas"/>
+                        <w:b w:val="0"/>
+                        <w:i w:val="0"/>
+                        <w:color w:val="FFFFFF"/>
+                        <w:sz w:val="2"/>
+                      </w:rPr>
+                      <w:t>«TableEnd:TaxSubTotal»</w:t>
+                    </w:r>
+                  </w:fldSimple>
+                </w:p>
+              </w:tc>
+            </w:tr>
+          </w:tbl>
+          <w:p/>
           <w:p>
             <w:pPr>
               <w:spacing w:before="80" w:after="80"/>
@@ -1345,6 +1296,97 @@
         </w:tc>
       </w:tr>
     </w:tbl>
+    <w:p>
+      <w:pPr>
+        <w:spacing w:before="0" w:after="240"/>
+      </w:pPr>
+    </w:p>
+    <w:p>
+      <w:pPr>
+        <w:spacing w:before="0" w:after="120"/>
+      </w:pPr>
+      <w:r>
+        <w:rPr>
+          <w:rFonts w:ascii="Trebuchet MS" w:hAnsi="Trebuchet MS" w:cs="Trebuchet MS"/>
+          <w:b/>
+          <w:i/>
+          <w:color w:val="07080C"/>
+          <w:sz w:val="56"/>
+        </w:rPr>
+        <w:t>Thanks.</w:t>
+      </w:r>
+    </w:p>
+    <w:p>
+      <w:pPr>
+        <w:spacing w:before="0" w:after="80"/>
+      </w:pPr>
+      <w:r>
+        <w:rPr>
+          <w:rFonts w:ascii="Calibri" w:hAnsi="Calibri" w:cs="Calibri"/>
+          <w:b w:val="0"/>
+          <w:i w:val="0"/>
+          <w:color w:val="525B6E"/>
+          <w:sz w:val="20"/>
+        </w:rPr>
+        <w:t xml:space="preserve">Questions or changes? Email </w:t>
+      </w:r>
+      <w:r>
+        <w:rPr>
+          <w:rFonts w:ascii="Calibri" w:hAnsi="Calibri" w:cs="Calibri"/>
+          <w:b/>
+          <w:i w:val="0"/>
+          <w:color w:val="07080C"/>
+          <w:sz w:val="20"/>
+        </w:rPr>
+        <w:t>hello@webgro.co.uk</w:t>
+      </w:r>
+      <w:r>
+        <w:rPr>
+          <w:rFonts w:ascii="Calibri" w:hAnsi="Calibri" w:cs="Calibri"/>
+          <w:b w:val="0"/>
+          <w:i w:val="0"/>
+          <w:color w:val="525B6E"/>
+          <w:sz w:val="20"/>
+        </w:rPr>
+        <w:t xml:space="preserve"> or call </w:t>
+      </w:r>
+      <w:r>
+        <w:rPr>
+          <w:rFonts w:ascii="Calibri" w:hAnsi="Calibri" w:cs="Calibri"/>
+          <w:b/>
+          <w:i w:val="0"/>
+          <w:color w:val="07080C"/>
+          <w:sz w:val="20"/>
+        </w:rPr>
+        <w:t>+44 (0) 1344 231 119</w:t>
+      </w:r>
+      <w:r>
+        <w:rPr>
+          <w:rFonts w:ascii="Calibri" w:hAnsi="Calibri" w:cs="Calibri"/>
+          <w:b w:val="0"/>
+          <w:i w:val="0"/>
+          <w:color w:val="525B6E"/>
+          <w:sz w:val="20"/>
+        </w:rPr>
+        <w:t>. We'll sort it.</w:t>
+      </w:r>
+    </w:p>
+    <w:p>
+      <w:pPr>
+        <w:spacing w:before="200" w:after="0"/>
+      </w:pPr>
+      <w:r>
+        <w:rPr>
+          <w:rFonts w:ascii="Consolas" w:hAnsi="Consolas" w:cs="Consolas"/>
+          <w:b w:val="0"/>
+          <w:i w:val="0"/>
+          <w:color w:val="8B94A8"/>
+          <w:sz w:val="14"/>
+          <w:spacing w:val="24"/>
+        </w:rPr>
+        <w:t>WEBGRO LTD  ·  REG 10889889  ·  PART OF BROADBRIDGE GROUP</w:t>
+      </w:r>
+    </w:p>
     <w:sectPr>
       <w:pgSz w:w="11906" w:h="16838"/>
       <w:pgMar w:top="737" w:right="850" w:bottom="737" w:left="850" w:header="720" w:footer="720" w:gutter="0"/>

</xml_diff>